<commit_message>
v1.13.21: Training guides: museum part 2 retitled Collections Procedures (file renamed to training-museum-2-procedures), screenshots for parts 1 and 2 refreshed from the re-recorded videos
</commit_message>
<xml_diff>
--- a/docs/training-museum-1-cataloguing.docx
+++ b/docs/training-museum-1-cataloguing.docx
@@ -829,7 +829,7 @@
         <w:rPr>
           <w:rStyle w:val="VerbatimChar"/>
         </w:rPr>
-        <w:t xml:space="preserve">MUS.2026.0016</w:t>
+        <w:t xml:space="preserve">MUS.2026.0018</w:t>
       </w:r>
       <w:r>
         <w:t xml:space="preserve">);</w:t>
@@ -1820,7 +1820,7 @@
         <w:pStyle w:val="FirstParagraph"/>
       </w:pPr>
       <w:r>
-        <w:t xml:space="preserve">Part 2 covers the Spectrum collections procedures.</w:t>
+        <w:t xml:space="preserve">Part 2 covers the collections procedures: object entry and acquisition.</w:t>
       </w:r>
     </w:p>
     <w:bookmarkEnd w:id="46"/>

</xml_diff>